<commit_message>
promote local -> dev (2026-09-15T18:11:15.658031+00:00)
</commit_message>
<xml_diff>
--- a/architecture/TargetArchitecture/1_ChatHealthyEnterpriseArchitecture.docx
+++ b/architecture/TargetArchitecture/1_ChatHealthyEnterpriseArchitecture.docx
@@ -528,13 +528,7 @@
               <w:rPr>
                 <w:sz w:val="22"/>
               </w:rPr>
-            </w:r>
-            <w:r>
-              <w:rPr>
-                <w:b/>
-                <w:sz w:val="22"/>
-              </w:rPr>
-              <w:t>deployable target</w:t>
+              <w:t>page</w:t>
             </w:r>
           </w:p>
         </w:tc>
@@ -547,12 +541,7 @@
               <w:rPr>
                 <w:sz w:val="22"/>
               </w:rPr>
-            </w:r>
-            <w:r>
-              <w:rPr>
-                <w:sz w:val="22"/>
-              </w:rPr>
-              <w:t>A host with packages, files, secrets and environment bindings.</w:t>
+              <w:t>The unit the application constructs from one or more product capabilities and reconciles before it responds. Its members, the subset required for it to be complete, and its render budget are declared in the composition record.</w:t>
             </w:r>
           </w:p>
         </w:tc>
@@ -565,12 +554,7 @@
               <w:rPr>
                 <w:sz w:val="22"/>
               </w:rPr>
-            </w:r>
-            <w:r>
-              <w:rPr>
-                <w:sz w:val="22"/>
-              </w:rPr>
-              <w:t>the DevOps Governance Framework</w:t>
+              <w:t>the Live Application Architecture</w:t>
             </w:r>
           </w:p>
         </w:tc>
@@ -591,7 +575,7 @@
                 <w:b/>
                 <w:sz w:val="22"/>
               </w:rPr>
-              <w:t>granted privilege</w:t>
+              <w:t>deployable target</w:t>
             </w:r>
           </w:p>
         </w:tc>
@@ -609,7 +593,7 @@
               <w:rPr>
                 <w:sz w:val="22"/>
               </w:rPr>
-              <w:t>Something a principal may reach.</w:t>
+              <w:t>A host with packages, files, secrets and environment bindings.</w:t>
             </w:r>
           </w:p>
         </w:tc>
@@ -627,7 +611,7 @@
               <w:rPr>
                 <w:sz w:val="22"/>
               </w:rPr>
-              <w:t>the Security Framework</w:t>
+              <w:t>the DevOps Governance Framework</w:t>
             </w:r>
           </w:p>
         </w:tc>
@@ -648,7 +632,7 @@
                 <w:b/>
                 <w:sz w:val="22"/>
               </w:rPr>
-              <w:t>component</w:t>
+              <w:t>granted privilege</w:t>
             </w:r>
           </w:p>
         </w:tc>
@@ -666,14 +650,7 @@
               <w:rPr>
                 <w:sz w:val="22"/>
               </w:rPr>
-              <w:t xml:space="preserve">A thing that runs and holds an identity. </w:t>
-            </w:r>
-            <w:r>
-              <w:rPr>
-                <w:b/>
-                <w:sz w:val="22"/>
-              </w:rPr>
-              <w:t>Never a source directory.</w:t>
+              <w:t>Something a principal may reach.</w:t>
             </w:r>
           </w:p>
         </w:tc>
@@ -691,7 +668,7 @@
               <w:rPr>
                 <w:sz w:val="22"/>
               </w:rPr>
-              <w:t>§2.4</w:t>
+              <w:t>the Security Framework</w:t>
             </w:r>
           </w:p>
         </w:tc>
@@ -712,7 +689,7 @@
                 <w:b/>
                 <w:sz w:val="22"/>
               </w:rPr>
-              <w:t>generation</w:t>
+              <w:t>component</w:t>
             </w:r>
           </w:p>
         </w:tc>
@@ -730,7 +707,14 @@
               <w:rPr>
                 <w:sz w:val="22"/>
               </w:rPr>
-              <w:t>A version of a published collection. Published when something binds to it.</w:t>
+              <w:t xml:space="preserve">A thing that runs and holds an identity. </w:t>
+            </w:r>
+            <w:r>
+              <w:rPr>
+                <w:b/>
+                <w:sz w:val="22"/>
+              </w:rPr>
+              <w:t>Never a source directory.</w:t>
             </w:r>
           </w:p>
         </w:tc>
@@ -748,7 +732,7 @@
               <w:rPr>
                 <w:sz w:val="22"/>
               </w:rPr>
-              <w:t>the Data Pipeline Framework, §2.8</w:t>
+              <w:t>§2.4</w:t>
             </w:r>
           </w:p>
         </w:tc>
@@ -769,7 +753,7 @@
                 <w:b/>
                 <w:sz w:val="22"/>
               </w:rPr>
-              <w:t>act</w:t>
+              <w:t>generation</w:t>
             </w:r>
           </w:p>
         </w:tc>
@@ -787,7 +771,7 @@
               <w:rPr>
                 <w:sz w:val="22"/>
               </w:rPr>
-              <w:t>One of the four in §2.7.2. Nothing else is an act.</w:t>
+              <w:t>A version of a published collection. Published when something binds to it.</w:t>
             </w:r>
           </w:p>
         </w:tc>
@@ -805,7 +789,7 @@
               <w:rPr>
                 <w:sz w:val="22"/>
               </w:rPr>
-              <w:t>the DevOps Governance Framework</w:t>
+              <w:t>the Data Pipeline Framework, §2.8</w:t>
             </w:r>
           </w:p>
         </w:tc>
@@ -826,6 +810,63 @@
                 <w:b/>
                 <w:sz w:val="22"/>
               </w:rPr>
+              <w:t>act</w:t>
+            </w:r>
+          </w:p>
+        </w:tc>
+        <w:tc>
+          <w:tcPr>
+            <w:tcW w:type="dxa" w:w="2880"/>
+          </w:tcPr>
+          <w:p>
+            <w:r>
+              <w:rPr>
+                <w:sz w:val="22"/>
+              </w:rPr>
+            </w:r>
+            <w:r>
+              <w:rPr>
+                <w:sz w:val="22"/>
+              </w:rPr>
+              <w:t>One of the four in §2.7.2. Nothing else is an act.</w:t>
+            </w:r>
+          </w:p>
+        </w:tc>
+        <w:tc>
+          <w:tcPr>
+            <w:tcW w:type="dxa" w:w="2880"/>
+          </w:tcPr>
+          <w:p>
+            <w:r>
+              <w:rPr>
+                <w:sz w:val="22"/>
+              </w:rPr>
+            </w:r>
+            <w:r>
+              <w:rPr>
+                <w:sz w:val="22"/>
+              </w:rPr>
+              <w:t>the DevOps Governance Framework</w:t>
+            </w:r>
+          </w:p>
+        </w:tc>
+      </w:tr>
+      <w:tr>
+        <w:tc>
+          <w:tcPr>
+            <w:tcW w:type="dxa" w:w="2880"/>
+          </w:tcPr>
+          <w:p>
+            <w:r>
+              <w:rPr>
+                <w:sz w:val="22"/>
+              </w:rPr>
+            </w:r>
+            <w:r>
+              <w:rPr>
+                <w:b/>
+                <w:sz w:val="22"/>
+              </w:rPr>
               <w:t>record</w:t>
             </w:r>
           </w:p>
@@ -863,6 +904,118 @@
                 <w:sz w:val="22"/>
               </w:rPr>
               <w:t>§2.5</w:t>
+            </w:r>
+          </w:p>
+        </w:tc>
+      </w:tr>
+      <w:tr>
+        <w:tc>
+          <w:tcPr>
+            <w:tcW w:type="dxa" w:w="2880"/>
+          </w:tcPr>
+          <w:p>
+            <w:r>
+              <w:rPr>
+                <w:sz w:val="22"/>
+              </w:rPr>
+            </w:r>
+            <w:r>
+              <w:rPr>
+                <w:sz w:val="22"/>
+              </w:rPr>
+              <w:t xml:space="preserve">gate</w:t>
+            </w:r>
+          </w:p>
+        </w:tc>
+        <w:tc>
+          <w:tcPr>
+            <w:tcW w:type="dxa" w:w="2880"/>
+          </w:tcPr>
+          <w:p>
+            <w:r>
+              <w:rPr>
+                <w:sz w:val="22"/>
+              </w:rPr>
+            </w:r>
+            <w:r>
+              <w:rPr>
+                <w:sz w:val="22"/>
+              </w:rPr>
+              <w:t xml:space="preserve">The transport facade a browser reaches. Collects the session token, the head and the parameters, dispatches, and streams the answer back. Owns no route and verifies nothing.</w:t>
+            </w:r>
+          </w:p>
+        </w:tc>
+        <w:tc>
+          <w:tcPr>
+            <w:tcW w:type="dxa" w:w="2880"/>
+          </w:tcPr>
+          <w:p>
+            <w:r>
+              <w:rPr>
+                <w:sz w:val="22"/>
+              </w:rPr>
+            </w:r>
+            <w:r>
+              <w:rPr>
+                <w:sz w:val="22"/>
+              </w:rPr>
+              <w:t xml:space="preserve">the Live Application Architecture</w:t>
+            </w:r>
+          </w:p>
+        </w:tc>
+      </w:tr>
+      <w:tr>
+        <w:tc>
+          <w:tcPr>
+            <w:tcW w:type="dxa" w:w="2880"/>
+          </w:tcPr>
+          <w:p>
+            <w:r>
+              <w:rPr>
+                <w:sz w:val="22"/>
+              </w:rPr>
+            </w:r>
+            <w:r>
+              <w:rPr>
+                <w:sz w:val="22"/>
+              </w:rPr>
+              <w:t xml:space="preserve">entrance</w:t>
+            </w:r>
+          </w:p>
+        </w:tc>
+        <w:tc>
+          <w:tcPr>
+            <w:tcW w:type="dxa" w:w="2880"/>
+          </w:tcPr>
+          <w:p>
+            <w:r>
+              <w:rPr>
+                <w:sz w:val="22"/>
+              </w:rPr>
+            </w:r>
+            <w:r>
+              <w:rPr>
+                <w:sz w:val="22"/>
+              </w:rPr>
+              <w:t xml:space="preserve">The authenticated surface behind the gate. Validates the session, routes, and manufactures the token — everything the gate does not.</w:t>
+            </w:r>
+          </w:p>
+        </w:tc>
+        <w:tc>
+          <w:tcPr>
+            <w:tcW w:type="dxa" w:w="2880"/>
+          </w:tcPr>
+          <w:p>
+            <w:r>
+              <w:rPr>
+                <w:sz w:val="22"/>
+              </w:rPr>
+            </w:r>
+            <w:r>
+              <w:rPr>
+                <w:sz w:val="22"/>
+              </w:rPr>
+              <w:t xml:space="preserve">§2.6</w:t>
             </w:r>
           </w:p>
         </w:tc>
@@ -3542,7 +3695,7 @@
               <w:rPr>
                 <w:sz w:val="22"/>
               </w:rPr>
-              <w:t>What more than one component needs and none should own: the tool contract, the exception type, logging, store acquisition, the model facade, the terminal-report escape. A versioned package.</w:t>
+              <w:t>What more than one component needs and none should own: the tool contract, the exception type, logging, store acquisition, the model facade, the deterministic merge, the terminal-report escape. A versioned package.</w:t>
             </w:r>
           </w:p>
         </w:tc>
@@ -3889,16 +4042,7 @@
         <w:rPr>
           <w:b/>
         </w:rPr>
-        <w:t>The application's composition is data, not code.</w:t>
-      </w:r>
-      <w:r>
-        <w:t xml:space="preserve"> Which product capabilities exist, which parameters each needs, which of those it requires, and which surfaces they appear on — a record, read where a component needs to know. Adding a product capability is a declaration and a deploy. This is the deployment record's argument one level up: </w:t>
-      </w:r>
-      <w:r>
-        <w:rPr>
-          <w:b/>
-        </w:rPr>
-        <w:t>a system whose shape is spread through its own source cannot state its shape.</w:t>
+        <w:t>The application's composition is data, not code. Which product capabilities exist, which parameters each needs, which of those it requires, which surfaces they appear on, and which pages the application constructs from them — a record, read where a component needs to know. A page is a first-class member of that record and the unit the application constructs and reconciles: it declares the capabilities that compose it, the subset the page needs to be complete, and the budget within which it must render. Adding a product capability, or a page, is a declaration and a deploy. This is the deployment record's argument one level up: a system whose shape is spread through its own source cannot state its shape. That record is generated from source at each build, so it cannot name a capability, route, parameter or page the build does not carry; its schema and lifecycle are the Live Application Architecture's. [I] The application constructs six pages today — a care giver, a facility and a clinical trial as result subjects, and a detail of each.</w:t>
       </w:r>
     </w:p>
     <w:p>
@@ -4583,7 +4727,7 @@
               <w:rPr>
                 <w:sz w:val="22"/>
               </w:rPr>
-              <w:t>Validates, routes, streams.</w:t>
+              <w:t xml:space="preserve">Collects the facts and dispatches; streams the answer back. The entrance behind it validates and routes.</w:t>
             </w:r>
           </w:p>
         </w:tc>
@@ -4660,6 +4804,11 @@
       </w:tr>
     </w:tbl>
     <w:p/>
+    <w:p>
+      <w:r>
+        <w:t xml:space="preserve">That division is about verbs — which class can be compelled to POST — not the roster of what arrives. The roster is a closed set of five inbound crossings, each a mapped route carrying one named proof: a tool calling another; a third party calling back on its own initiative, carrying a credential the firm keeps; the onload witness of a static page the firm owns; a client the firm served and holds a session for; and a tool's own completion callback into the entrance. The proof at each is one of four and no fifth — nothing to verify, an API key named in the vault, the signed session token, or the firm's own signature over a dispatch it sent out. §2.6.5 carries the crossings; the route mechanics are the Live Application Architecture's.</w:t>
+      </w:r>
+    </w:p>
     <w:p>
       <w:r>
         <w:rPr>
@@ -5326,6 +5475,80 @@
           </w:p>
         </w:tc>
       </w:tr>
+      <w:tr>
+        <w:tc>
+          <w:tcPr>
+            <w:tcW w:type="dxa" w:w="2160"/>
+          </w:tcPr>
+          <w:p>
+            <w:r>
+              <w:rPr>
+                <w:sz w:val="22"/>
+              </w:rPr>
+            </w:r>
+            <w:r>
+              <w:rPr>
+                <w:sz w:val="22"/>
+              </w:rPr>
+              <w:t xml:space="preserve">Is this a completion we dispatched?</w:t>
+            </w:r>
+          </w:p>
+        </w:tc>
+        <w:tc>
+          <w:tcPr>
+            <w:tcW w:type="dxa" w:w="2160"/>
+          </w:tcPr>
+          <w:p>
+            <w:r>
+              <w:rPr>
+                <w:sz w:val="22"/>
+              </w:rPr>
+            </w:r>
+            <w:r>
+              <w:rPr>
+                <w:sz w:val="22"/>
+              </w:rPr>
+              <w:t xml:space="preserve">a returning callback answers a dispatch the entrance signed out</w:t>
+            </w:r>
+          </w:p>
+        </w:tc>
+        <w:tc>
+          <w:tcPr>
+            <w:tcW w:type="dxa" w:w="2160"/>
+          </w:tcPr>
+          <w:p>
+            <w:r>
+              <w:rPr>
+                <w:sz w:val="22"/>
+              </w:rPr>
+            </w:r>
+            <w:r>
+              <w:rPr>
+                <w:sz w:val="22"/>
+              </w:rPr>
+              <w:t xml:space="preserve">every completion</w:t>
+            </w:r>
+          </w:p>
+        </w:tc>
+        <w:tc>
+          <w:tcPr>
+            <w:tcW w:type="dxa" w:w="2160"/>
+          </w:tcPr>
+          <w:p>
+            <w:r>
+              <w:rPr>
+                <w:sz w:val="22"/>
+              </w:rPr>
+            </w:r>
+            <w:r>
+              <w:rPr>
+                <w:sz w:val="22"/>
+              </w:rPr>
+              <w:t xml:space="preserve">the entrance, against its own signature</w:t>
+            </w:r>
+          </w:p>
+        </w:tc>
+      </w:tr>
     </w:tbl>
     <w:p/>
     <w:p>
@@ -5494,6 +5717,12 @@
     <w:p>
       <w:r>
         <w:t>The entrance carries what the person said and the talk before it, and reads nothing else. It does not know what a search is made of, what makes one valid, or what is missing from one. The component that owns the question mines its own parameters and states its own sufficiency.</w:t>
+      </w:r>
+    </w:p>
+    <w:p>
+      <w:pPr/>
+      <w:r>
+        <w:t>The page is the boundary-visible unit of that division. The entrance determines from the map which page a request constructs and scopes the owning component's mining to that page's members — which page is a navigation fact the map carries, not domain knowledge the entrance holds. It reconciles the page — waits on the members the page requires — before it responds, or responds within the page's declared budget when a member does not arrive. What a member is made of, and whether it is sufficient, stays the component's.</w:t>
       </w:r>
     </w:p>
     <w:p>
@@ -5678,7 +5907,7 @@
               <w:rPr>
                 <w:sz w:val="22"/>
               </w:rPr>
-              <w:t>A signed reference the firm issued and can verify, arriving by the sender's method at an address the gate owns</w:t>
+              <w:t xml:space="preserve">The credential the firm keeps from the vendor — named in the vault, never held in the clear — and, on top of it, a signed anti-replay reference the firm issued and verifies on return, arriving by the sender's method at an address the gate owns</w:t>
             </w:r>
           </w:p>
         </w:tc>
@@ -5723,7 +5952,7 @@
               <w:rPr>
                 <w:sz w:val="22"/>
               </w:rPr>
-              <w:t>Entrance → capability component</w:t>
+              <w:t xml:space="preserve">Static page → entrance</w:t>
             </w:r>
           </w:p>
         </w:tc>
@@ -5741,7 +5970,7 @@
               <w:rPr>
                 <w:sz w:val="22"/>
               </w:rPr>
-              <w:t>The signed token, what the person said, the prior dialogue</w:t>
+              <w:t xml:space="preserve">The page's name, witnessed by an onload in a frame the firm owns — nothing to verify, so the proof is none. Logged when the frame pops; static errors logged when they occur</w:t>
             </w:r>
           </w:p>
         </w:tc>
@@ -5759,7 +5988,7 @@
               <w:rPr>
                 <w:sz w:val="22"/>
               </w:rPr>
-              <w:t>A search criterion. A caller that may pass one may omit one</w:t>
+              <w:t xml:space="preserve">A decision. The weakest inbound crossing, and the one whose home is most arguably the interior: it decides nothing</w:t>
             </w:r>
           </w:p>
         </w:tc>
@@ -5779,6 +6008,62 @@
               <w:rPr>
                 <w:sz w:val="22"/>
               </w:rPr>
+              <w:t>Entrance → capability component</w:t>
+            </w:r>
+          </w:p>
+        </w:tc>
+        <w:tc>
+          <w:tcPr>
+            <w:tcW w:type="dxa" w:w="2880"/>
+          </w:tcPr>
+          <w:p>
+            <w:r>
+              <w:rPr>
+                <w:sz w:val="22"/>
+              </w:rPr>
+            </w:r>
+            <w:r>
+              <w:rPr>
+                <w:sz w:val="22"/>
+              </w:rPr>
+              <w:t>The signed token, what the person said, the prior dialogue</w:t>
+            </w:r>
+          </w:p>
+        </w:tc>
+        <w:tc>
+          <w:tcPr>
+            <w:tcW w:type="dxa" w:w="2880"/>
+          </w:tcPr>
+          <w:p>
+            <w:r>
+              <w:rPr>
+                <w:sz w:val="22"/>
+              </w:rPr>
+            </w:r>
+            <w:r>
+              <w:rPr>
+                <w:sz w:val="22"/>
+              </w:rPr>
+              <w:t>A search criterion. A caller that may pass one may omit one</w:t>
+            </w:r>
+          </w:p>
+        </w:tc>
+      </w:tr>
+      <w:tr>
+        <w:tc>
+          <w:tcPr>
+            <w:tcW w:type="dxa" w:w="2880"/>
+          </w:tcPr>
+          <w:p>
+            <w:r>
+              <w:rPr>
+                <w:sz w:val="22"/>
+              </w:rPr>
+            </w:r>
+            <w:r>
+              <w:rPr>
+                <w:sz w:val="22"/>
+              </w:rPr>
               <w:t>Component → component</w:t>
             </w:r>
           </w:p>
@@ -5816,6 +6101,62 @@
                 <w:sz w:val="22"/>
               </w:rPr>
               <w:t>A browser hop. A person's browser never addresses two components</w:t>
+            </w:r>
+          </w:p>
+        </w:tc>
+      </w:tr>
+      <w:tr>
+        <w:tc>
+          <w:tcPr>
+            <w:tcW w:type="dxa" w:w="2880"/>
+          </w:tcPr>
+          <w:p>
+            <w:r>
+              <w:rPr>
+                <w:sz w:val="22"/>
+              </w:rPr>
+            </w:r>
+            <w:r>
+              <w:rPr>
+                <w:sz w:val="22"/>
+              </w:rPr>
+              <w:t xml:space="preserve">Tool completion → entrance</w:t>
+            </w:r>
+          </w:p>
+        </w:tc>
+        <w:tc>
+          <w:tcPr>
+            <w:tcW w:type="dxa" w:w="2880"/>
+          </w:tcPr>
+          <w:p>
+            <w:r>
+              <w:rPr>
+                <w:sz w:val="22"/>
+              </w:rPr>
+            </w:r>
+            <w:r>
+              <w:rPr>
+                <w:sz w:val="22"/>
+              </w:rPr>
+              <w:t xml:space="preserve">The firm's own signature over the dispatch it sent out, returned on the completion callback and verified against a named signing key. A satellite's answer returns this way</w:t>
+            </w:r>
+          </w:p>
+        </w:tc>
+        <w:tc>
+          <w:tcPr>
+            <w:tcW w:type="dxa" w:w="2880"/>
+          </w:tcPr>
+          <w:p>
+            <w:r>
+              <w:rPr>
+                <w:sz w:val="22"/>
+              </w:rPr>
+            </w:r>
+            <w:r>
+              <w:rPr>
+                <w:sz w:val="22"/>
+              </w:rPr>
+              <w:t xml:space="preserve">A fresh request. This proves a returning callback, not an arriving call</w:t>
             </w:r>
           </w:p>
         </w:tc>
@@ -12509,12 +12850,7 @@
               <w:rPr>
                 <w:sz w:val="22"/>
               </w:rPr>
-            </w:r>
-            <w:r>
-              <w:rPr>
-                <w:sz w:val="22"/>
-              </w:rPr>
-              <w:t>every component name, every host</w:t>
+              <w:t>every component name, every host, every page name</w:t>
             </w:r>
           </w:p>
         </w:tc>

</xml_diff>

<commit_message>
promote local -> dev (2026-09-16T18:10:47.698561+00:00)
</commit_message>
<xml_diff>
--- a/architecture/TargetArchitecture/1_ChatHealthyEnterpriseArchitecture.docx
+++ b/architecture/TargetArchitecture/1_ChatHealthyEnterpriseArchitecture.docx
@@ -1723,7 +1723,7 @@
       <w:r>
         <w:drawing>
           <wp:inline xmlns:a="http://schemas.openxmlformats.org/drawingml/2006/main" xmlns:pic="http://schemas.openxmlformats.org/drawingml/2006/picture">
-            <wp:extent cx="4306973" cy="7680959"/>
+            <wp:extent cx="3385113" cy="7680959"/>
             <wp:docPr id="1" name="Picture 1"/>
             <wp:cNvGraphicFramePr>
               <a:graphicFrameLocks noChangeAspect="1"/>
@@ -1744,7 +1744,7 @@
                   <pic:spPr>
                     <a:xfrm>
                       <a:off x="0" y="0"/>
-                      <a:ext cx="4306973" cy="7680959"/>
+                      <a:ext cx="3385113" cy="7680959"/>
                     </a:xfrm>
                     <a:prstGeom prst="rect"/>
                   </pic:spPr>
@@ -3915,7 +3915,7 @@
       <w:r>
         <w:drawing>
           <wp:inline xmlns:a="http://schemas.openxmlformats.org/drawingml/2006/main" xmlns:pic="http://schemas.openxmlformats.org/drawingml/2006/picture">
-            <wp:extent cx="5715000" cy="3655177"/>
+            <wp:extent cx="5715000" cy="1762968"/>
             <wp:docPr id="2" name="Picture 2"/>
             <wp:cNvGraphicFramePr>
               <a:graphicFrameLocks noChangeAspect="1"/>
@@ -3936,7 +3936,7 @@
                   <pic:spPr>
                     <a:xfrm>
                       <a:off x="0" y="0"/>
-                      <a:ext cx="5715000" cy="3655177"/>
+                      <a:ext cx="5715000" cy="1762968"/>
                     </a:xfrm>
                     <a:prstGeom prst="rect"/>
                   </pic:spPr>
@@ -4042,7 +4042,7 @@
         <w:rPr>
           <w:b/>
         </w:rPr>
-        <w:t>The application's composition is data, not code. Which product capabilities exist, which parameters each needs, which of those it requires, which surfaces they appear on, and which pages the application constructs from them — a record, read where a component needs to know. A page is a first-class member of that record and the unit the application constructs and reconciles: it declares the capabilities that compose it, the subset the page needs to be complete, and the budget within which it must render. Adding a product capability, or a page, is a declaration and a deploy. This is the deployment record's argument one level up: a system whose shape is spread through its own source cannot state its shape. That record is generated from source at each build, so it cannot name a capability, route, parameter or page the build does not carry; its schema and lifecycle are the Live Application Architecture's. [I] The application constructs six pages today — a care giver, a facility and a clinical trial as result subjects, and a detail of each.</w:t>
+        <w:t>The application's composition is data, not code. Which product capabilities exist, which parameters each needs, which of those it requires, which surfaces they appear on, and which pages the application constructs from them — a record, read where a component needs to know. A page is a first-class member of that record and the unit the application constructs and reconciles: it declares the capabilities that compose it, the subset the page needs to be complete, and the budget within which it must render. Adding a product capability, or a page, is a declaration and a deploy. This is the deployment record's argument one level up: a system whose shape is spread through its own source cannot state its shape. That record is generated from source at each build, so it cannot name a capability, route, parameter or page the build does not carry; its schema and lifecycle are the Live Application Architecture's. [I] The application constructs three pages today — an individual provider, a facility and a clinical trial. A detail and the specialty filter are members of a page, never pages of their own: the specialty filter composes the individual-provider page, and a page presenting only that one member is not yet complete — which is the reconciliation the entrance performs against the members the page declares it requires.</w:t>
       </w:r>
     </w:p>
     <w:p>
@@ -4490,7 +4490,7 @@
       <w:r>
         <w:drawing>
           <wp:inline xmlns:a="http://schemas.openxmlformats.org/drawingml/2006/main" xmlns:pic="http://schemas.openxmlformats.org/drawingml/2006/picture">
-            <wp:extent cx="8001000" cy="3407229"/>
+            <wp:extent cx="6996312" cy="3407229"/>
             <wp:docPr id="3" name="Picture 3"/>
             <wp:cNvGraphicFramePr>
               <a:graphicFrameLocks noChangeAspect="1"/>
@@ -4511,7 +4511,7 @@
                   <pic:spPr>
                     <a:xfrm>
                       <a:off x="0" y="0"/>
-                      <a:ext cx="8001000" cy="3407229"/>
+                      <a:ext cx="6996312" cy="3407229"/>
                     </a:xfrm>
                     <a:prstGeom prst="rect"/>
                   </pic:spPr>
@@ -5071,7 +5071,7 @@
       <w:r>
         <w:drawing>
           <wp:inline xmlns:a="http://schemas.openxmlformats.org/drawingml/2006/main" xmlns:pic="http://schemas.openxmlformats.org/drawingml/2006/picture">
-            <wp:extent cx="5715000" cy="4216893"/>
+            <wp:extent cx="4048316" cy="4216893"/>
             <wp:docPr id="4" name="Picture 4"/>
             <wp:cNvGraphicFramePr>
               <a:graphicFrameLocks noChangeAspect="1"/>
@@ -5092,7 +5092,7 @@
                   <pic:spPr>
                     <a:xfrm>
                       <a:off x="0" y="0"/>
-                      <a:ext cx="5715000" cy="4216893"/>
+                      <a:ext cx="4048316" cy="4216893"/>
                     </a:xfrm>
                     <a:prstGeom prst="rect"/>
                   </pic:spPr>
@@ -6477,7 +6477,7 @@
       <w:r>
         <w:drawing>
           <wp:inline xmlns:a="http://schemas.openxmlformats.org/drawingml/2006/main" xmlns:pic="http://schemas.openxmlformats.org/drawingml/2006/picture">
-            <wp:extent cx="5715000" cy="5601399"/>
+            <wp:extent cx="5715000" cy="4034445"/>
             <wp:docPr id="5" name="Picture 5"/>
             <wp:cNvGraphicFramePr>
               <a:graphicFrameLocks noChangeAspect="1"/>
@@ -6498,7 +6498,7 @@
                   <pic:spPr>
                     <a:xfrm>
                       <a:off x="0" y="0"/>
-                      <a:ext cx="5715000" cy="5601399"/>
+                      <a:ext cx="5715000" cy="4034445"/>
                     </a:xfrm>
                     <a:prstGeom prst="rect"/>
                   </pic:spPr>
@@ -6709,7 +6709,7 @@
       <w:r>
         <w:drawing>
           <wp:inline xmlns:a="http://schemas.openxmlformats.org/drawingml/2006/main" xmlns:pic="http://schemas.openxmlformats.org/drawingml/2006/picture">
-            <wp:extent cx="4190586" cy="7680959"/>
+            <wp:extent cx="4190586" cy="1035696"/>
             <wp:docPr id="6" name="Picture 6"/>
             <wp:cNvGraphicFramePr>
               <a:graphicFrameLocks noChangeAspect="1"/>
@@ -6730,7 +6730,7 @@
                   <pic:spPr>
                     <a:xfrm>
                       <a:off x="0" y="0"/>
-                      <a:ext cx="4190586" cy="7680959"/>
+                      <a:ext cx="4190586" cy="1035696"/>
                     </a:xfrm>
                     <a:prstGeom prst="rect"/>
                   </pic:spPr>
@@ -7714,7 +7714,7 @@
         <w:t>[I]</w:t>
       </w:r>
       <w:r>
-        <w:t xml:space="preserve"> All four environments bind one front-end cluster, and dev, qa and prod bind one vault; all four currently bind the same data generation. Because the binding is a record value, giving them different generations is a commit rather than a project. §5.</w:t>
+        <w:t xml:space="preserve"> All four environments bind one front-end cluster, and dev, qa and prod bind one vault; all four currently bind the same data generation. Because the binding is a record value, giving them different generations is a commit rather than a project.</w:t>
       </w:r>
     </w:p>
     <w:p>
@@ -8552,6 +8552,12 @@
       </w:r>
     </w:p>
     <w:p>
+      <w:pPr/>
+      <w:r>
+        <w:t>[I] The safety lockout is where this floor is layered rather than a single model call. First contact on a never-before-seen utterance is still the model's — now pinned to temperature 0, a real bug fixed, because the model default flipped borderline emergencies. Every lockout then records the uppercased verbatim utterance into a UserLockOutUtterances collection with a count, so a later utterance of the exact same words is a deterministic repeat: the system learns from what has locked people out. Staff review a monthly operational report of those utterances, ordered by frequency, and curate which become trusted deterministic triggers. The model carries the unknown; a curated, crowd-sourced exact-match list carries the known.</w:t>
+      </w:r>
+    </w:p>
+    <w:p>
       <w:pPr>
         <w:pStyle w:val="Heading3"/>
       </w:pPr>
@@ -10779,58 +10785,51 @@
               <w:rPr>
                 <w:sz w:val="22"/>
               </w:rPr>
+              <w:t>The unauthenticated session-minting route sits outside the gate. Separately, resuming a session currently requires knowledge of a 32-hex identifier that travels in request bodies, which makes any log that captured one a credential store.</w:t>
             </w:r>
             <w:r>
               <w:rPr>
                 <w:b/>
                 <w:sz w:val="22"/>
               </w:rPr>
-              <w:t>The unauthenticated session-minting route sits outside the gate</w:t>
-            </w:r>
-            <w:r>
-              <w:rPr>
-                <w:sz w:val="22"/>
-              </w:rPr>
-              <w:t xml:space="preserve">, and unlike 8a this one is a genuine either/or that only the operator can pick: an unauthenticated </w:t>
+            </w:r>
+            <w:r>
+              <w:rPr>
+                <w:sz w:val="22"/>
+              </w:rPr>
             </w:r>
             <w:r>
               <w:rPr>
                 <w:i/>
                 <w:sz w:val="22"/>
               </w:rPr>
-              <w:t>op on the gate</w:t>
-            </w:r>
-            <w:r>
-              <w:rPr>
-                <w:sz w:val="22"/>
-              </w:rPr>
-              <w:t xml:space="preserve"> weakens "no op is exempt", and a separate endpoint weakens "one entrance". Both weaken something. </w:t>
+            </w:r>
+            <w:r>
+              <w:rPr>
+                <w:sz w:val="22"/>
+              </w:rPr>
             </w:r>
             <w:r>
               <w:rPr>
                 <w:b/>
                 <w:sz w:val="22"/>
               </w:rPr>
-              <w:t>Not scheduled, because the shape of the fix is undecided.</w:t>
-            </w:r>
-            <w:r>
-              <w:rPr>
-                <w:sz w:val="22"/>
-              </w:rPr>
-              <w:t xml:space="preserve"> §5. Separately and not part of that choice: </w:t>
+            </w:r>
+            <w:r>
+              <w:rPr>
+                <w:sz w:val="22"/>
+              </w:rPr>
             </w:r>
             <w:r>
               <w:rPr>
                 <w:b/>
                 <w:sz w:val="22"/>
               </w:rPr>
-              <w:t>resuming</w:t>
-            </w:r>
-            <w:r>
-              <w:rPr>
-                <w:sz w:val="22"/>
-              </w:rPr>
-              <w:t xml:space="preserve"> a session currently requires knowledge of a 32-hex identifier that travels in request bodies, which makes any log that captured one a credential store.</w:t>
+            </w:r>
+            <w:r>
+              <w:rPr>
+                <w:sz w:val="22"/>
+              </w:rPr>
             </w:r>
           </w:p>
         </w:tc>
@@ -12201,218 +12200,6 @@
       </w:r>
       <w:r>
         <w:t xml:space="preserve"> Four artifacts found this independently; one found the remedy; it is G-2.</w:t>
-      </w:r>
-    </w:p>
-    <w:p>
-      <w:pPr>
-        <w:pStyle w:val="Heading2"/>
-      </w:pPr>
-      <w:r>
-        <w:t>5. Open questions — operator only</w:t>
-      </w:r>
-    </w:p>
-    <w:p>
-      <w:r>
-        <w:t>The consolidated list is on the board and the Security Framework holds its authoritative form as eleven decisions. Two condition all the others and nothing else is worth answering first:</w:t>
-      </w:r>
-    </w:p>
-    <w:p>
-      <w:pPr>
-        <w:pStyle w:val="ListNumber"/>
-      </w:pPr>
-      <w:r>
-        <w:rPr>
-          <w:b/>
-        </w:rPr>
-        <w:t>What channel carries an authorisation the workstation cannot originate?</w:t>
-      </w:r>
-      <w:r>
-        <w:t xml:space="preserve"> Every</w:t>
-      </w:r>
-    </w:p>
-    <w:p>
-      <w:r>
-        <w:t xml:space="preserve">authorisation in the firm terminates in one function, and that function trusts a value the governed process supplies. No same-machine hardening closes it. </w:t>
-      </w:r>
-      <w:r>
-        <w:rPr>
-          <w:i/>
-        </w:rPr>
-        <w:t>(Register row 2, G-1.)</w:t>
-      </w:r>
-    </w:p>
-    <w:p>
-      <w:pPr>
-        <w:pStyle w:val="ListNumber"/>
-      </w:pPr>
-      <w:r>
-        <w:rPr>
-          <w:b/>
-        </w:rPr>
-        <w:t>Is the agent's platform privilege meant to be the declared constrained role?</w:t>
-      </w:r>
-      <w:r>
-        <w:t xml:space="preserve"> It is</w:t>
-      </w:r>
-    </w:p>
-    <w:p>
-      <w:r>
-        <w:t xml:space="preserve">not, today, and the divergence is at a scope above every control written to constrain it. By construction the agent cannot narrow its own assignment and have that mean anything. </w:t>
-      </w:r>
-      <w:r>
-        <w:rPr>
-          <w:i/>
-        </w:rPr>
-        <w:t>(Register row 1, G-6.)</w:t>
-      </w:r>
-    </w:p>
-    <w:p>
-      <w:r>
-        <w:t>Nine further decisions sit on the board. Four are the parent's to name here because they bear on boundaries this document states:</w:t>
-      </w:r>
-    </w:p>
-    <w:p>
-      <w:pPr>
-        <w:pStyle w:val="ListNumber"/>
-      </w:pPr>
-      <w:r>
-        <w:rPr>
-          <w:b/>
-        </w:rPr>
-        <w:t>Session issuance: an unauthenticated op on the gate, or a separate endpoint?</w:t>
-      </w:r>
-      <w:r>
-        <w:t xml:space="preserve"> This is</w:t>
-      </w:r>
-    </w:p>
-    <w:p>
-      <w:r>
-        <w:t xml:space="preserve">the residue of the one-entrance question and it is the only part of it still open. An unauthenticated op weakens </w:t>
-      </w:r>
-      <w:r>
-        <w:rPr>
-          <w:i/>
-        </w:rPr>
-        <w:t>no op is exempt</w:t>
-      </w:r>
-      <w:r>
-        <w:t xml:space="preserve">; a separate endpoint weakens </w:t>
-      </w:r>
-      <w:r>
-        <w:rPr>
-          <w:i/>
-        </w:rPr>
-        <w:t>one entrance</w:t>
-      </w:r>
-      <w:r>
-        <w:t xml:space="preserve">. </w:t>
-      </w:r>
-      <w:r>
-        <w:rPr>
-          <w:b/>
-        </w:rPr>
-        <w:t>Both weaken something and no third shape exists</w:t>
-      </w:r>
-      <w:r>
-        <w:t xml:space="preserve">, which is why it is here and not scheduled. </w:t>
-      </w:r>
-      <w:r>
-        <w:rPr>
-          <w:i/>
-        </w:rPr>
-        <w:t>(Register row 8b. The rest of that question is settled: the requirement carries two classes, nothing is exempt, and the identity-provider callback is scheduled work — see §2.6.1a.)</w:t>
-      </w:r>
-    </w:p>
-    <w:p>
-      <w:pPr>
-        <w:pStyle w:val="ListNumber"/>
-      </w:pPr>
-      <w:r>
-        <w:rPr>
-          <w:b/>
-        </w:rPr>
-        <w:t>Do the four environments share one store, one vault and one data generation by intent?</w:t>
-      </w:r>
-    </w:p>
-    <w:p>
-      <w:r>
-        <w:t xml:space="preserve">They do. Because the binding is a record value, separating them is a commit rather than a project — which changes the decision from </w:t>
-      </w:r>
-      <w:r>
-        <w:rPr>
-          <w:i/>
-        </w:rPr>
-        <w:t>buy separation</w:t>
-      </w:r>
-      <w:r>
-        <w:t xml:space="preserve"> to </w:t>
-      </w:r>
-      <w:r>
-        <w:rPr>
-          <w:i/>
-        </w:rPr>
-        <w:t>decide whether you want it</w:t>
-      </w:r>
-      <w:r>
-        <w:t>.</w:t>
-      </w:r>
-    </w:p>
-    <w:p>
-      <w:pPr>
-        <w:pStyle w:val="ListNumber"/>
-      </w:pPr>
-      <w:r>
-        <w:rPr>
-          <w:b/>
-        </w:rPr>
-        <w:t>The data pipeline has no requirements.</w:t>
-      </w:r>
-      <w:r>
-        <w:t xml:space="preserve"> Fifteen approved requirements govern moving a</w:t>
-      </w:r>
-    </w:p>
-    <w:p>
-      <w:r>
-        <w:t xml:space="preserve">collection without changing it; three govern a reaper; </w:t>
-      </w:r>
-      <w:r>
-        <w:rPr>
-          <w:b/>
-        </w:rPr>
-        <w:t>nothing governs fetch, staging, load, enrichment, validation, publication, provenance or quality.</w:t>
-      </w:r>
-      <w:r>
-        <w:t xml:space="preserve"> The firm has specified the transfer of its data and not the manufacture of it. A stage with no requirement cannot be made falsifiable even in principle.</w:t>
-      </w:r>
-    </w:p>
-    <w:p>
-      <w:pPr>
-        <w:pStyle w:val="ListNumber"/>
-      </w:pPr>
-      <w:r>
-        <w:rPr>
-          <w:b/>
-        </w:rPr>
-        <w:t>Which of the firm's rules about itself deserve to be requirements?</w:t>
-      </w:r>
-      <w:r>
-        <w:t xml:space="preserve"> The strongest</w:t>
-      </w:r>
-    </w:p>
-    <w:p>
-      <w:r>
-        <w:t>controls in the system — the branch restriction, authorisation at the moment, the post-commit rollback, the circumvention record — are in force with no product requirement behind them. Legitimate, and it means an auditor tracing the strongest control finds a rule and nothing behind it.</w:t>
-      </w:r>
-    </w:p>
-    <w:p>
-      <w:r>
-        <w:rPr>
-          <w:b/>
-        </w:rPr>
-        <w:t>No requirement is authored anywhere in this document.</w:t>
-      </w:r>
-      <w:r>
-        <w:t xml:space="preserve"> Where a gap was found, it is here.</w:t>
       </w:r>
     </w:p>
     <w:p>
@@ -13318,67 +13105,11 @@
           </w:p>
         </w:tc>
       </w:tr>
-      <w:tr>
-        <w:tc>
-          <w:tcPr>
-            <w:tcW w:type="dxa" w:w="2880"/>
-          </w:tcPr>
-          <w:p>
-            <w:r>
-              <w:rPr>
-                <w:sz w:val="22"/>
-              </w:rPr>
-            </w:r>
-            <w:r>
-              <w:rPr>
-                <w:sz w:val="22"/>
-              </w:rPr>
-              <w:t>§5 Open questions</w:t>
-            </w:r>
-          </w:p>
-        </w:tc>
-        <w:tc>
-          <w:tcPr>
-            <w:tcW w:type="dxa" w:w="2880"/>
-          </w:tcPr>
-          <w:p>
-            <w:r>
-              <w:rPr>
-                <w:sz w:val="22"/>
-              </w:rPr>
-            </w:r>
-            <w:r>
-              <w:rPr>
-                <w:sz w:val="22"/>
-              </w:rPr>
-              <w:t>nothing</w:t>
-            </w:r>
-          </w:p>
-        </w:tc>
-        <w:tc>
-          <w:tcPr>
-            <w:tcW w:type="dxa" w:w="2880"/>
-          </w:tcPr>
-          <w:p>
-            <w:r>
-              <w:rPr>
-                <w:sz w:val="22"/>
-              </w:rPr>
-            </w:r>
-            <w:r>
-              <w:rPr>
-                <w:sz w:val="22"/>
-              </w:rPr>
-              <w:t>all of it</w:t>
-            </w:r>
-          </w:p>
-        </w:tc>
-      </w:tr>
     </w:tbl>
     <w:p/>
     <w:p>
       <w:r>
-        <w:t>A different firm in a different domain adopts §0, §1, §2.1–§2.3, §2.6–§2.10 and §3 entire; it replaces §2.4's contents, §2.10's named frameworks, §4 and §5.</w:t>
+        <w:t>A different firm in a different domain adopts §0, §1, §2.1–§2.3, §2.6–§2.10 and §3 entire; it replaces §2.4's contents, §2.10's named frameworks, §4.</w:t>
       </w:r>
     </w:p>
     <w:p>

</xml_diff>

<commit_message>
promote local -> dev (2026-09-20T23:28:35.753815+00:00)
</commit_message>
<xml_diff>
--- a/architecture/TargetArchitecture/1_ChatHealthyEnterpriseArchitecture.docx
+++ b/architecture/TargetArchitecture/1_ChatHealthyEnterpriseArchitecture.docx
@@ -3915,7 +3915,7 @@
       <w:r>
         <w:drawing>
           <wp:inline xmlns:a="http://schemas.openxmlformats.org/drawingml/2006/main" xmlns:pic="http://schemas.openxmlformats.org/drawingml/2006/picture">
-            <wp:extent cx="5715000" cy="1762968"/>
+            <wp:extent cx="3193436" cy="1762968"/>
             <wp:docPr id="2" name="Picture 2"/>
             <wp:cNvGraphicFramePr>
               <a:graphicFrameLocks noChangeAspect="1"/>
@@ -3936,7 +3936,7 @@
                   <pic:spPr>
                     <a:xfrm>
                       <a:off x="0" y="0"/>
-                      <a:ext cx="5715000" cy="1762968"/>
+                      <a:ext cx="3193436" cy="1762968"/>
                     </a:xfrm>
                     <a:prstGeom prst="rect"/>
                   </pic:spPr>
@@ -3957,7 +3957,7 @@
           <w:color w:val="6B7280"/>
           <w:sz w:val="17"/>
         </w:rPr>
-        <w:t>The components and what each owns. The browser touches exactly one box; the governance plane is not in the request path.</w:t>
+        <w:t>The components and what each owns. The browser touches exactly one box; the governance plane is not in the request path. The operator's workstation, the user's OAuth login into the MongoDB store — the Session and Registered Users collections kept separately — and the Azure plane's children (Data Pipelines, Vault, Entra, Workflow Manager) are drawn.</w:t>
       </w:r>
     </w:p>
     <w:p>
@@ -4490,7 +4490,7 @@
       <w:r>
         <w:drawing>
           <wp:inline xmlns:a="http://schemas.openxmlformats.org/drawingml/2006/main" xmlns:pic="http://schemas.openxmlformats.org/drawingml/2006/picture">
-            <wp:extent cx="6996312" cy="3407229"/>
+            <wp:extent cx="6661667" cy="3407229"/>
             <wp:docPr id="3" name="Picture 3"/>
             <wp:cNvGraphicFramePr>
               <a:graphicFrameLocks noChangeAspect="1"/>
@@ -4511,7 +4511,7 @@
                   <pic:spPr>
                     <a:xfrm>
                       <a:off x="0" y="0"/>
-                      <a:ext cx="6996312" cy="3407229"/>
+                      <a:ext cx="6661667" cy="3407229"/>
                     </a:xfrm>
                     <a:prstGeom prst="rect"/>
                   </pic:spPr>
@@ -5071,7 +5071,7 @@
       <w:r>
         <w:drawing>
           <wp:inline xmlns:a="http://schemas.openxmlformats.org/drawingml/2006/main" xmlns:pic="http://schemas.openxmlformats.org/drawingml/2006/picture">
-            <wp:extent cx="4048316" cy="4216893"/>
+            <wp:extent cx="3690971" cy="4216893"/>
             <wp:docPr id="4" name="Picture 4"/>
             <wp:cNvGraphicFramePr>
               <a:graphicFrameLocks noChangeAspect="1"/>
@@ -5092,7 +5092,7 @@
                   <pic:spPr>
                     <a:xfrm>
                       <a:off x="0" y="0"/>
-                      <a:ext cx="4048316" cy="4216893"/>
+                      <a:ext cx="3690971" cy="4216893"/>
                     </a:xfrm>
                     <a:prstGeom prst="rect"/>
                   </pic:spPr>
@@ -6709,7 +6709,7 @@
       <w:r>
         <w:drawing>
           <wp:inline xmlns:a="http://schemas.openxmlformats.org/drawingml/2006/main" xmlns:pic="http://schemas.openxmlformats.org/drawingml/2006/picture">
-            <wp:extent cx="4190586" cy="1035696"/>
+            <wp:extent cx="3551242" cy="1035696"/>
             <wp:docPr id="6" name="Picture 6"/>
             <wp:cNvGraphicFramePr>
               <a:graphicFrameLocks noChangeAspect="1"/>
@@ -6730,7 +6730,7 @@
                   <pic:spPr>
                     <a:xfrm>
                       <a:off x="0" y="0"/>
-                      <a:ext cx="4190586" cy="1035696"/>
+                      <a:ext cx="3551242" cy="1035696"/>
                     </a:xfrm>
                     <a:prstGeom prst="rect"/>
                   </pic:spPr>
@@ -6751,7 +6751,7 @@
           <w:color w:val="6B7280"/>
           <w:sz w:val="17"/>
         </w:rPr>
-        <w:t>The four acts and the one direction. No act reaches another's kind of state, and no arrow runs backwards.</w:t>
+        <w:t>The four acts and the one direction. No act reaches another's kind of state, and no arrow runs backwards. A commit is all-or-nothing: one file failing any scan fails the entire commit.</w:t>
       </w:r>
     </w:p>
     <w:p>
@@ -7294,7 +7294,7 @@
               <w:rPr>
                 <w:sz w:val="22"/>
               </w:rPr>
-              <w:t>The session and its page parameters</w:t>
+              <w:t>The session and its page parameters; and, as a separate collection, the registered users the firm maintains</w:t>
             </w:r>
           </w:p>
         </w:tc>
@@ -7724,7 +7724,7 @@
       <w:r>
         <w:drawing>
           <wp:inline xmlns:a="http://schemas.openxmlformats.org/drawingml/2006/main" xmlns:pic="http://schemas.openxmlformats.org/drawingml/2006/picture">
-            <wp:extent cx="2657492" cy="7680959"/>
+            <wp:extent cx="2308771" cy="7680959"/>
             <wp:docPr id="7" name="Picture 7"/>
             <wp:cNvGraphicFramePr>
               <a:graphicFrameLocks noChangeAspect="1"/>
@@ -7745,7 +7745,7 @@
                   <pic:spPr>
                     <a:xfrm>
                       <a:off x="0" y="0"/>
-                      <a:ext cx="2657492" cy="7680959"/>
+                      <a:ext cx="2308771" cy="7680959"/>
                     </a:xfrm>
                     <a:prstGeom prst="rect"/>
                   </pic:spPr>
@@ -7766,7 +7766,7 @@
           <w:color w:val="6B7280"/>
           <w:sz w:val="17"/>
         </w:rPr>
-        <w:t>Which target runs where, per environment. The environment selects the host; the target's contents are the same in all four.</w:t>
+        <w:t>Which target runs where, per environment. The environment selects the host; the target's contents are the same in all four. The split into two resource groups (WorkManagement and AzureInfrastructure), distinguishing logical deployments by package rather than by target, is a proposal under consideration — shown for discussion, not adopted.</w:t>
       </w:r>
     </w:p>
     <w:p>
@@ -13196,6 +13196,361 @@
       </w:r>
       <w:r>
         <w:t xml:space="preserve"> It is the only artefact that measures whether the gates mean anything, and every number in §4 that a buyer would want is a row in it.</w:t>
+      </w:r>
+    </w:p>
+    <w:p>
+      <w:pPr>
+        <w:pStyle w:val="Heading2"/>
+      </w:pPr>
+      <w:r>
+        <w:t>Appendix — Findings, Issues and Open Issues</w:t>
+      </w:r>
+    </w:p>
+    <w:p>
+      <w:pPr/>
+      <w:r>
+        <w:t>Every finding, issue and open issue this document raises, gathered in one place and numbered. Each entry states the matter and its kind: a finding is a claim walked against disk or the platform and found not true; an issue is a named, unresolved structural tension the firm has acknowledged; an open issue is a question not yet established, carrying an owner. Entries 1-22 consolidate section 4's non-compliance register (its row number is given); entries 23-29 gather matters stated in the prose of section 2 and section 3 and two gaps this audit surfaced against the current code. Nothing here supersedes section 4; this is its index, not its replacement. Two shapes recur: the actor being governed writes the record of its own governance (entries 1, 2, 3, 14), and every gate checks a declaration is well-formed and present while none checks it is true (entries 4, 5, 6, 18).</w:t>
+      </w:r>
+    </w:p>
+    <w:p>
+      <w:r>
+        <w:rPr>
+          <w:b/>
+        </w:rPr>
+        <w:t xml:space="preserve">1. [FINDING] </w:t>
+      </w:r>
+      <w:r>
+        <w:t>Register row 1 - section 2.1.1 / G-6. An agent may not create an identity and the constraint may not be lifted by the constrained party. The constraint is declared in the repository and is NOT in force on the platform: the live role withholds nothing, and the self-including condition governs nothing because the same principal separately holds an unconditioned higher-scope assignment that carries identity creation directly. A control that reads as present in the record and is absent in fact. Evidence: data.</w:t>
+      </w:r>
+    </w:p>
+    <w:p>
+      <w:r>
+        <w:rPr>
+          <w:b/>
+        </w:rPr>
+        <w:t xml:space="preserve">2. [FINDING] </w:t>
+      </w:r>
+      <w:r>
+        <w:t>Register row 2 - G-1. The human-presence proof is a client-supplied string the server trusts: the handler checks a form field equal to the literal "true" while the presence tests run in the page's own script and post that field, and the approval URL is written where the invoking process reads it. Commit, promote, deploy and the data release all terminate in this one function. Evidence: behaviour, verified independently twice.</w:t>
+      </w:r>
+    </w:p>
+    <w:p>
+      <w:r>
+        <w:rPr>
+          <w:b/>
+        </w:rPr>
+        <w:t xml:space="preserve">3. [FINDING] </w:t>
+      </w:r>
+      <w:r>
+        <w:t>Register row 3 - section 2.7.1 / section 2.1.1. Nothing constrains what an agent may run against remote state. The rule intended to gate it carries an empty enforcement list; the hook it would fire on is not registered; and the harness's own permission layer is off. Three independent things are missing, so fixing one restores nothing. Evidence: data.</w:t>
+      </w:r>
+    </w:p>
+    <w:p>
+      <w:r>
+        <w:rPr>
+          <w:b/>
+        </w:rPr>
+        <w:t xml:space="preserve">4. [FINDING] </w:t>
+      </w:r>
+      <w:r>
+        <w:t>Register row 4 - section 2.2.3. 331 of 377 record-level file entries (88 per cent) resolve to one feature that owns almost none of them; zero entries lack a value, so the referential-integrity gate is green throughout. The record is an index in form and a single wrong answer in substance. Evidence: data.</w:t>
+      </w:r>
+    </w:p>
+    <w:p>
+      <w:r>
+        <w:rPr>
+          <w:b/>
+        </w:rPr>
+        <w:t xml:space="preserve">5. [FINDING] </w:t>
+      </w:r>
+      <w:r>
+        <w:t>Register row 5 - P-13. No runtime module outside the facade may obtain a model client; the principle is violated eight times across five files, and the check aimed at the mechanism a defect record described (direct vendor-SDK construction, which now exists in two files, neither with a caller) reports green over all eight. The live bypass constructs the facade's own substrate. Evidence: behaviour.</w:t>
+      </w:r>
+    </w:p>
+    <w:p>
+      <w:r>
+        <w:rPr>
+          <w:b/>
+        </w:rPr>
+        <w:t xml:space="preserve">6. [FINDING] </w:t>
+      </w:r>
+      <w:r>
+        <w:t>Register row 6 - G-5 and section 2.4's governance-plane row. The governance substrate is ungoverned: all four repository hooks live in a directory that is never committed, none is tracked, none appears in the deployment record. The hook that unmakes an unapproved commit is a file the governed process can rewrite with no commit showing it. Evidence: data.</w:t>
+      </w:r>
+    </w:p>
+    <w:p>
+      <w:r>
+        <w:rPr>
+          <w:b/>
+        </w:rPr>
+        <w:t xml:space="preserve">7. [FINDING] </w:t>
+      </w:r>
+      <w:r>
+        <w:t>Register row 7 - section 2.6.2. A component verifies the entrance's signature on every route it serves. One (FindCare) does so on twelve of fourteen routes; the other (EvaluateCare) verifies on none of the routes that serve work, so for it the one-entrance property fails in both directions. Confirmed current in this audit: FindCare calls require_gateway_signature on twelve routes; EvaluateCare's app has no signature verification. Evidence: behaviour.</w:t>
+      </w:r>
+    </w:p>
+    <w:p>
+      <w:r>
+        <w:rPr>
+          <w:b/>
+        </w:rPr>
+        <w:t xml:space="preserve">8. [FINDING] </w:t>
+      </w:r>
+      <w:r>
+        <w:t>Register row 8 - section 2.6.1 / section 2.6.5. A browser fetch addresses a capability component directly on that component's one unguarded non-health route, so both halves of the boundary fail at the same line. Scheduled: the route moves in the migration's Phase 3, but the move alone does not close it - routing the caller through the gate is the closing act. Evidence: behaviour + requirement.</w:t>
+      </w:r>
+    </w:p>
+    <w:p>
+      <w:r>
+        <w:rPr>
+          <w:b/>
+        </w:rPr>
+        <w:t xml:space="preserve">8a. [FINDING + OPEN ISSUE] </w:t>
+      </w:r>
+      <w:r>
+        <w:t>Register row 8a - section 2.6.1a. The identity-provider callback and start routes sit outside the gate. Confirmed current: sharedServices/Code/app.py exposes /auth/google/start and /auth/google/callback as their own routes. The operator has settled nothing is exempt and every mechanism to route them is already present, so this is scheduled work of Phase 4's shape. OPEN ISSUE: the Refactor Plan (06_migration section 3) does NOT enumerate this move; the Refactor Plan is asked to add it, and no phase may be cited until it carries the work. Evidence: behaviour.</w:t>
+      </w:r>
+    </w:p>
+    <w:p>
+      <w:r>
+        <w:rPr>
+          <w:b/>
+        </w:rPr>
+        <w:t xml:space="preserve">8b. [FINDING] </w:t>
+      </w:r>
+      <w:r>
+        <w:t>Register row 8b - section 2.6.1a. The unauthenticated session-minting route sits outside the gate; separately, resuming a session requires knowledge of a 32-hex identifier that travels in request bodies, which makes any log that captured one a credential store. Evidence: behaviour. Raised by the Security Framework.</w:t>
+      </w:r>
+    </w:p>
+    <w:p>
+      <w:r>
+        <w:rPr>
+          <w:b/>
+        </w:rPr>
+        <w:t xml:space="preserve">9. [FINDING] </w:t>
+      </w:r>
+      <w:r>
+        <w:t>Register row 9 - section 2.6.5. The transport under the component-to-component signature authenticates nobody: the shared library's own cross-service call disables peer-certificate verification on the same call that forwards the session token, so every tool inheriting the contract ships without transport authentication, and twenty further call sites do it by hand. Evidence: behaviour.</w:t>
+      </w:r>
+    </w:p>
+    <w:p>
+      <w:r>
+        <w:rPr>
+          <w:b/>
+        </w:rPr>
+        <w:t xml:space="preserve">10. [FINDING] </w:t>
+      </w:r>
+      <w:r>
+        <w:t>Register row 10 - section 2.6.5 row 1. The browser-tier courier holds a general-purpose execution primitive on an unauthenticated broadcast channel: a message type whose payload is executed as code with the exception swallowed, no receiver checks the sender, every cross-frame send targets any origin. Routine protocol, not a corner case. Evidence: behaviour.</w:t>
+      </w:r>
+    </w:p>
+    <w:p>
+      <w:r>
+        <w:rPr>
+          <w:b/>
+        </w:rPr>
+        <w:t xml:space="preserve">11. [FINDING] </w:t>
+      </w:r>
+      <w:r>
+        <w:t>Register row 11 - section 2.8 rules 1 and 4. The application replaces whole documents in the bound served generation from the request path and writes derived fields into them under the runtime identity, destroying pipeline-computed fields and breaking the generation's provenance. No approved requirement asks for it. Evidence: behaviour + requirement.</w:t>
+      </w:r>
+    </w:p>
+    <w:p>
+      <w:r>
+        <w:rPr>
+          <w:b/>
+        </w:rPr>
+        <w:t xml:space="preserve">12. [ISSUE] </w:t>
+      </w:r>
+      <w:r>
+        <w:t>Register row 12 - section 2.5. The identity registry is a key inside the deployment record: one artifact carrying two concerns, so an identity change and a deployment change are one kind of event to every reader. Named rather than discovered, acknowledged for its benefit (one gate) and its cost (one event), and unresolved. Evidence: data.</w:t>
+      </w:r>
+    </w:p>
+    <w:p>
+      <w:r>
+        <w:rPr>
+          <w:b/>
+        </w:rPr>
+        <w:t xml:space="preserve">13. [FINDING] </w:t>
+      </w:r>
+      <w:r>
+        <w:t>Register row 13 - section 2.9. All four environments bind one front-end cluster and one data generation; dev, qa and prod bind one vault. The promotion chain governs the code and nothing about the data or the credentials, so a failure in one environment can reach another. Disclosed in section 2.9 rather than implied away. Evidence: data.</w:t>
+      </w:r>
+    </w:p>
+    <w:p>
+      <w:r>
+        <w:rPr>
+          <w:b/>
+        </w:rPr>
+        <w:t xml:space="preserve">14. [FINDING] </w:t>
+      </w:r>
+      <w:r>
+        <w:t>Register row 14 - section 2.8 rule 1 and G-2. The release identity can insert into the collection holding the record that releases it. The grant is needed for a legitimate purpose (the service records its own acknowledgement) but a store grant is per collection, not per document type; append-only protects a record from its writer, not from an actor who is also a writer. Evidence: data.</w:t>
+      </w:r>
+    </w:p>
+    <w:p>
+      <w:r>
+        <w:rPr>
+          <w:b/>
+        </w:rPr>
+        <w:t xml:space="preserve">15. [FINDING] </w:t>
+      </w:r>
+      <w:r>
+        <w:t>Register row 15 - section 2.7.2. A fifth, ungated act exists: a program connects to the serving store as the deploy identity, drops the destination collection when non-empty and refills it, with no environment guard, no approval and no record. It is undeclared, so no gate can see it. Separately, the enforcement of the three-entry-point rule permits a fourth file by listing it. Evidence: behaviour + data.</w:t>
+      </w:r>
+    </w:p>
+    <w:p>
+      <w:r>
+        <w:rPr>
+          <w:b/>
+        </w:rPr>
+        <w:t xml:space="preserve">16. [FINDING] </w:t>
+      </w:r>
+      <w:r>
+        <w:t>Register row 16 - section 2.3. The firm operates a trust chain without an issuer: the leaf-certificate minting module is absent from disk, and the caller that mints still imports it and therefore raises. Validating a chain works; issuing does not. Evidence: behaviour.</w:t>
+      </w:r>
+    </w:p>
+    <w:p>
+      <w:r>
+        <w:rPr>
+          <w:b/>
+        </w:rPr>
+        <w:t xml:space="preserve">17. [FINDING] </w:t>
+      </w:r>
+      <w:r>
+        <w:t>Register row 17 - P-3, P-4, P-9, P-10, P-11, P-12. None of evaluation, drift-pinning, model-decision audit, cost/latency instrumentation, the per-vendor permitted-field set, or explicit sampling is implemented. These are the six that make a model-mediated system operable after it works. Evidence: behaviour.</w:t>
+      </w:r>
+    </w:p>
+    <w:p>
+      <w:r>
+        <w:rPr>
+          <w:b/>
+        </w:rPr>
+        <w:t xml:space="preserve">18. [FINDING] </w:t>
+      </w:r>
+      <w:r>
+        <w:t>Register row 18 - section 2.5. Nothing checks internal reference integrity: the gate checks a reference that crosses records but no check walks the references inside one; two target references resolve to nothing, cited four times each; one target in nineteen declares the runtime its code needs. Evidence: data.</w:t>
+      </w:r>
+    </w:p>
+    <w:p>
+      <w:r>
+        <w:rPr>
+          <w:b/>
+        </w:rPr>
+        <w:t xml:space="preserve">19. [FINDING] </w:t>
+      </w:r>
+      <w:r>
+        <w:t>Register row 19 - section 2.4. The composition record's tool names do not join to the code, so "declared equals dispatched" cannot be evaluated. The record names tools in PascalCase (ProviderSearch, 56 occurrences); every *_tool.py exports snake_case; the package the record points at for provider search exports no tool name at all. This blocks the migration's Phase 0 gate 2, written to fail in either direction and currently unable to key either side. Evidence: behaviour + data. (Current numbers in entry 29.)</w:t>
+      </w:r>
+    </w:p>
+    <w:p>
+      <w:r>
+        <w:rPr>
+          <w:b/>
+        </w:rPr>
+        <w:t xml:space="preserve">20. [FINDING + OPEN ISSUE] </w:t>
+      </w:r>
+      <w:r>
+        <w:t>Register row 20 - section 2.6.5 row 6. The repository's diagram renderer constructs a URL against a public rendering host and fetches the image over plain HTTP; what would cross is the firm's architecture source, including the file enumerating every identity, its roles, the vault layout and every custom-role grant. It appears in no boundary table and no record. OPEN ISSUE: not established whether the images on disk were produced by that path; someone should establish which, because it decides whether this is an exposure that happened or a mechanism that would cause one. Evidence: behaviour + data.</w:t>
+      </w:r>
+    </w:p>
+    <w:p>
+      <w:r>
+        <w:rPr>
+          <w:b/>
+        </w:rPr>
+        <w:t xml:space="preserve">21. [FINDING] </w:t>
+      </w:r>
+      <w:r>
+        <w:t>Section 3 G-2 [I]. The architecture's soundness is low and one of its two readers is weak: of six classes of declared fact, only two have an independent reading that could contradict the declaration, and one of those two is weak - the target reports a build number read from a file baked into its own image, so it establishes arrival rather than contents. Evidence: data.</w:t>
+      </w:r>
+    </w:p>
+    <w:p>
+      <w:r>
+        <w:rPr>
+          <w:b/>
+        </w:rPr>
+        <w:t xml:space="preserve">22. [FINDING] </w:t>
+      </w:r>
+      <w:r>
+        <w:t>Sections 6 / 7. Of the seven governance principles G-1 to G-7, one is met and six are unmet; the three product principles the firm designed around (the language boundary, the system authoring facts, materialising before acting) are met. The two most consequential governance gaps were found by reading a platform and a request handler after two rounds of review had passed over both. Evidence: the register, summarised.</w:t>
+      </w:r>
+    </w:p>
+    <w:p>
+      <w:r>
+        <w:rPr>
+          <w:b/>
+        </w:rPr>
+        <w:t xml:space="preserve">23. [FINDING] </w:t>
+      </w:r>
+      <w:r>
+        <w:t>Section 3 G-7 [I]. Citation drift is live across all three classes of citation the firm makes, and the defect appeared in all three within one day: a comment naming a requirement id resolves to the id but not to what the requirement says; a register row naming a defect resolves to the defect but not to whether its description matched the code; a register row naming a refactor phase resolves to the phase but not to whether the phase carries the work. All three are lexically extractable and checkable by one gate that does not yet run over them. Evidence: behaviour + data.</w:t>
+      </w:r>
+    </w:p>
+    <w:p>
+      <w:r>
+        <w:rPr>
+          <w:b/>
+        </w:rPr>
+        <w:t xml:space="preserve">24. [FINDING] </w:t>
+      </w:r>
+      <w:r>
+        <w:t>Section 3 P-7 [I]. The safety-lockout first-contact model call previously ran at a non-zero default temperature and flipped borderline emergencies. Remediated: it is now pinned to temperature 0, and each lockout records the uppercased verbatim utterance so an exact repeat becomes a deterministic trigger. Recorded so the fix is on the register beside the finding it closed. Evidence: behaviour.</w:t>
+      </w:r>
+    </w:p>
+    <w:p>
+      <w:r>
+        <w:rPr>
+          <w:b/>
+        </w:rPr>
+        <w:t xml:space="preserve">25. [ISSUE] </w:t>
+      </w:r>
+      <w:r>
+        <w:t>Section 4 row 4 parenthetical. Two independent file-entry counting sets exist over the same record - this document counts 331 of 377 record-level entries, the DevOps Governance Framework counts 337 of 385 by including package-level entries. Both are right; that two sets exist over one record is itself the DevOps framework's NC-7. Evidence: data.</w:t>
+      </w:r>
+    </w:p>
+    <w:p>
+      <w:r>
+        <w:rPr>
+          <w:b/>
+        </w:rPr>
+        <w:t xml:space="preserve">26. [OPEN ISSUE] </w:t>
+      </w:r>
+      <w:r>
+        <w:t>Section 2.9 [I]. The proposed split of the deployment into two resource groups (WorkManagement and AzureInfrastructure), distinguishing logical deployments by package rather than by target, is under consideration - shown for discussion, not adopted. Owner: the DevOps Governance Framework. Evidence: intent.</w:t>
+      </w:r>
+    </w:p>
+    <w:p>
+      <w:r>
+        <w:rPr>
+          <w:b/>
+        </w:rPr>
+        <w:t xml:space="preserve">27. [OPEN ISSUE] </w:t>
+      </w:r>
+      <w:r>
+        <w:t>Section 2.5 ruling. The permitted-data-class set per model vendor is ruled to be a key inside the deployment record (not a sixth record), inheriting the identity registry's gate and its cost; it is not yet added, and whoever adds it should say so at the time. This is the declaration P-11 (entry 17) needs. Owner: whoever implements P-11. Evidence: intent.</w:t>
+      </w:r>
+    </w:p>
+    <w:p>
+      <w:r>
+        <w:rPr>
+          <w:b/>
+        </w:rPr>
+        <w:t xml:space="preserve">28. [FINDING] </w:t>
+      </w:r>
+      <w:r>
+        <w:t>New (this audit). The refactor-conformance gate that measures "the legacy tree is gone" is mis-specified for the current per-component structure. Its files_still_in_it count reads git ls-files Code and is 0 - the top-level Code/ tree is gone - but its referrer check counts the bare substring "Code/" in every tracked file, which also matches the still-present per-component subdirectories FindCare/Code/, evaluateCare/Code/ and sharedServices/Code/. It therefore reports RED with 54 files and 453 references (dominated by deployment_architecture.json at 168) that point at the legitimate per-component trees, and can never read green while those exist. The gate and the exit criterion it encodes both need re-anchoring on the top-level tree (a leading Code/) rather than the substring. Evidence: behaviour - refactor_conformance.py read and run.</w:t>
+      </w:r>
+    </w:p>
+    <w:p>
+      <w:r>
+        <w:rPr>
+          <w:b/>
+        </w:rPr>
+        <w:t xml:space="preserve">29. [FINDING] </w:t>
+      </w:r>
+      <w:r>
+        <w:t>New (this audit), updating entry 19 with current numbers. The refactor-conformance gate "declared equals dispatched" returns CANNOT EVALUATE: the record declares 7 tools in PascalCase (ClinicalTrials, FacilityDetail, FacilitySearch, ProviderDetail, ProviderSearch, ProviderSelection, SpecialtyFilter) and the code declares 19 in snake_case, with 0 names in common. Progress since the register: the CapabilityContract base class now exists (contract_exists = True), but it has 0 adopters, so the join the gate needs is still absent and adoption is the remaining Phase 1 work. Evidence: behaviour + data - refactor_conformance.py run.</w:t>
       </w:r>
     </w:p>
     <w:sectPr>

</xml_diff>

<commit_message>
Pipeline LLD v63, Target Architecture updates, and bug-list revisions
LLD v63: Medicare pipeline (Part III), run-status API, trust registry, backward-compat, per-section renumbering, and operator review fixes.

Target Architecture: pipeline framework, enterprise, web schema registry, and the diagrams catalogue (Medicare + provider component diagram).

bugs.json: added BUG-006/009/013/014; deleted addressed/non-real bugs.

Co-Authored-By: Claude Opus 4.8 <noreply@anthropic.com>
</commit_message>
<xml_diff>
--- a/architecture/TargetArchitecture/1_ChatHealthyEnterpriseArchitecture.docx
+++ b/architecture/TargetArchitecture/1_ChatHealthyEnterpriseArchitecture.docx
@@ -13196,6 +13196,19 @@
       </w:r>
       <w:r>
         <w:t xml:space="preserve"> It is the only artefact that measures whether the gates mean anything, and every number in §4 that a buyer would want is a row in it.</w:t>
+      </w:r>
+    </w:p>
+    <w:p>
+      <w:pPr>
+        <w:pStyle w:val="Heading2"/>
+      </w:pPr>
+      <w:r>
+        <w:t>Pipeline capability - trust and the Medicare instance</w:t>
+      </w:r>
+    </w:p>
+    <w:p>
+      <w:r>
+        <w:t>The data-pipeline capability now carries a trustworthiness-and-auditability model (EPIC-010-F-002): every derived fact a pipeline publishes carries a trust value traceable to the rule and the build that set it, held in one registry shared across a run's nodes. The capability also now admits a second pipeline instance, the Medicare Provider Evaluation Data Pipeline (EPIC-010-F-007), built on the same generic run lifecycle as the provider pipeline. Both are detailed in the Data Pipeline Framework and the Pipeline Low-Level Design.</w:t>
       </w:r>
     </w:p>
     <w:p>

</xml_diff>